<commit_message>
Update design doc to reflect EvaluateDynamicProperty refactor
- CacheVariables type: Dictionary<string,string> -> dynamic
- Cache implementation: ExpandoObject -> JObject via EvaluateDynamicProperty
- Error handling: CacheVariableException -> EvaluateDynamicPropertyException
- Status: Failed_CacheVariable -> Failed_EvaluateDynamicProperty
- Design decision 7.4: Updated rationale for JObject approach

Co-authored-by: Copilot <223556219+Copilot@users.noreply.github.com>
</commit_message>
<xml_diff>
--- a/CacheVariables-Design.docx
+++ b/CacheVariables-Design.docx
@@ -127,7 +127,7 @@
     </w:p>
     <w:p>
       <w:r>
-        <w:t>A new optional property CacheVariables is added to the TreeNode contract. It is a Dictionary&lt;string, string&gt; where the key is the variable name and the value is a Roslyn expression (or string literal) evaluated via the existing EvaluateDynamicProperty infrastructure.</w:t>
+        <w:t>A new optional property CacheVariables is added to the TreeNode contract. It is typed as dynamic (matching the pattern used by Properties, Input, and TreeInput) where each key is the variable name and the value is an expression evaluated via the existing EvaluateDynamicProperty infrastructure.</w:t>
       </w:r>
     </w:p>
     <w:p>
@@ -174,7 +174,7 @@
         <w:pStyle w:val="ListNumber"/>
       </w:pPr>
       <w:r>
-        <w:t>Clear Cache — fresh ExpandoObject per node</w:t>
+        <w:t>Clear Cache — reset to null for the new node</w:t>
       </w:r>
     </w:p>
     <w:p>
@@ -211,7 +211,7 @@
     </w:p>
     <w:p>
       <w:r>
-        <w:t>Cache variables are strictly node-scoped. The Cache ExpandoObject is cleared at the start of each VisitNode call:</w:t>
+        <w:t>Cache variables are strictly node-scoped. The Cache is cleared (set to null) at the start of each VisitNode call:</w:t>
       </w:r>
     </w:p>
     <w:p>
@@ -301,7 +301,7 @@
     </w:p>
     <w:p>
       <w:r>
-        <w:t>The Cache is implemented as a System.Dynamic.ExpandoObject exposed as a dynamic property on CodeGenInputParams. This provides:</w:t>
+        <w:t>The Cache is the result of calling EvaluateDynamicProperty(treeNode.CacheVariables, null). When CacheVariables is a JSON object with string values, EvaluateDynamicProperty evaluates each value recursively (handling C#| Roslyn expressions) and returns a JObject with the resolved results. JObject implements IDynamicMetaObjectProvider, enabling dot-notation access in Roslyn expressions (Cache.myVar). This provides:</w:t>
       </w:r>
     </w:p>
     <w:p>
@@ -401,7 +401,7 @@
           </w:tcPr>
           <w:p>
             <w:r>
-              <w:t>Dictionary&lt;string, string&gt;</w:t>
+              <w:t>dynamic</w:t>
             </w:r>
           </w:p>
         </w:tc>
@@ -603,7 +603,7 @@
     </w:p>
     <w:p>
       <w:r>
-        <w:t>If a CacheVariable expression fails to evaluate, a CacheVariableException is thrown. This exception wraps the inner EvaluateDynamicPropertyException and includes:</w:t>
+        <w:t>If a CacheVariable expression fails to evaluate, an EvaluateDynamicPropertyException is thrown. This is the same exception type used for all other dynamic property evaluation failures in the library (Input, Properties, ShouldSelect, etc.). The exception includes the failing expression in its message.</w:t>
       </w:r>
     </w:p>
     <w:p>
@@ -633,7 +633,7 @@
     <w:p/>
     <w:p>
       <w:r>
-        <w:t>The WalkTree method catches this exception and sets Status to "Failed_CacheVariable". Common failure cases:</w:t>
+        <w:t>The WalkTree method catches this exception and sets Status to "Failed_EvaluateDynamicProperty" (the same status used for all expression evaluation failures). Common failure cases:</w:t>
       </w:r>
     </w:p>
     <w:p>
@@ -730,12 +730,12 @@
         <w:pStyle w:val="Heading2"/>
       </w:pPr>
       <w:r>
-        <w:t>7.4 Why ExpandoObject?</w:t>
+        <w:t>7.4 Why JObject (via EvaluateDynamicProperty)?</w:t>
       </w:r>
     </w:p>
     <w:p>
       <w:r>
-        <w:t>ExpandoObject provides clean dot-notation syntax (Cache.x) consistent with the existing UserContext pattern. Alternatives considered:</w:t>
+        <w:t>Rather than using a custom resolver with ExpandoObject, CacheVariables is evaluated through the existing EvaluateDynamicProperty method, which returns a JObject. JObject provides clean dot-notation syntax (Cache.x) via its IDynamicMetaObjectProvider implementation. This approach was chosen for consistency with how Properties, Input, and TreeInput are handled throughout the library. Alternatives considered:</w:t>
       </w:r>
     </w:p>
     <w:tbl>
@@ -881,7 +881,7 @@
     <w:p/>
     <w:p>
       <w:r>
-        <w:t>ExpandoObject was chosen for consistency and simplicity. The tradeoff is that accessing undefined properties throws RuntimeBinderException rather than returning null.</w:t>
+        <w:t>JObject via EvaluateDynamicProperty was chosen for consistency and simplicity. The entire CacheVariables evaluation is a single method call, matching the library pattern. JValue comparisons with primitives work correctly via operator overloads (e.g., Cache.myVar == "expected" evaluates as expected).</w:t>
       </w:r>
     </w:p>
     <w:p>
@@ -926,7 +926,7 @@
         <w:pStyle w:val="ListBullet"/>
       </w:pPr>
       <w:r>
-        <w:t>Cache ExpandoObject is always present in expressions but empty by default</w:t>
+        <w:t>Cache is null by default when no CacheVariables are defined</w:t>
       </w:r>
     </w:p>
     <w:p>
@@ -1016,7 +1016,7 @@
           </w:tcPr>
           <w:p>
             <w:r>
-              <w:t>Added Cache (ExpandoObject) to CodeGenInputParams, GetCache()/ClearCache()</w:t>
+              <w:t>Cache uses SetCache/ClearCache with JObject instead of ExpandoObject</w:t>
             </w:r>
           </w:p>
         </w:tc>
@@ -1060,7 +1060,7 @@
           </w:tcPr>
           <w:p>
             <w:r>
-              <w:t>Added GetCache(), ResolveCacheVariables(), ClearCache in VisitNode</w:t>
+              <w:t>Replaced ResolveCacheVariables with inline EvaluateDynamicProperty call</w:t>
             </w:r>
           </w:p>
         </w:tc>
@@ -1082,7 +1082,7 @@
           </w:tcPr>
           <w:p>
             <w:r>
-              <w:t>Added CacheVariableException</w:t>
+              <w:t>Removed CacheVariableException (uses existing EvaluateDynamicPropertyException)</w:t>
             </w:r>
           </w:p>
         </w:tc>
@@ -1160,7 +1160,7 @@
         <w:pStyle w:val="ListBullet"/>
       </w:pPr>
       <w:r>
-        <w:t>Invalid expression error handling (CacheVariableException)</w:t>
+        <w:t>Invalid expression error handling (EvaluateDynamicPropertyException)</w:t>
       </w:r>
     </w:p>
     <w:p>

</xml_diff>